<commit_message>
Andrew's trigger, seven-step first review, and source list; GLO Google Doc
- references/trigger.md: >10% one-day drop, >$200M market cap, Canadian
  listing or Canadian-registered SEDAR+ filer listed in the US
- skills/first-review: his seven steps (SEDAR+ profile, drop-date records,
  1-3 key facts, a year of MD&As, language change, calls, price history)
- scripts/price_history.py: close/volume from 1 year + 30 days before the
  drop, flags earlier 10%+ falls
- source-hierarchy: his source list with access route per source (paid
  sources via user exports); PACER and Seeking Alpha no longer excluded
- triage: trigger applied to every row; render_memo: literal (a)/(i) lists

Co-Authored-By: Claude Opus 5.5 <noreply@anthropic.com>
Claude-Session: https://claude.ai/code/session_01MUmyveBYncLpMzBnjzsNju
</commit_message>
<xml_diff>
--- a/research-analyst/runs/2025-01-24/GLO/memo.docx
+++ b/research-analyst/runs/2025-01-24/GLO/memo.docx
@@ -306,13 +306,10 @@
     </w:p>
     <w:p>
       <w:pPr>
-        <w:numPr>
-          <w:ilvl w:val="0"/>
-          <w:numId w:val="1001"/>
-        </w:numPr>
-      </w:pPr>
-      <w:r>
-        <w:t xml:space="preserve">the status of the application before the DFC, i.e., that the loan had not been placed before the DFC's credit committee or board on any of the dates reported;</w:t>
+        <w:pStyle w:val="BodyText"/>
+      </w:pPr>
+      <w:r>
+        <w:t xml:space="preserve">(a) the status of the application before the DFC, i.e., that the loan had not been placed before the DFC's credit committee or board on any of the dates reported;</w:t>
       </w:r>
       <w:r>
         <w:rPr>
@@ -323,29 +320,23 @@
     </w:p>
     <w:p>
       <w:pPr>
-        <w:numPr>
-          <w:ilvl w:val="0"/>
-          <w:numId w:val="1001"/>
-        </w:numPr>
-      </w:pPr>
-      <w:r>
-        <w:t xml:space="preserve">the reasons for each delay and the pre-conditions to approval, including the effect of the breakdown in relations between Niger and the United States on the loan; and</w:t>
-      </w:r>
-    </w:p>
-    <w:p>
-      <w:pPr>
-        <w:numPr>
-          <w:ilvl w:val="0"/>
-          <w:numId w:val="1001"/>
-        </w:numPr>
-      </w:pPr>
-      <w:r>
-        <w:t xml:space="preserve">the timing of the DFC's pause, which GLO later admitted began before the 2024 U.S. presidential election, while GLO was reporting that the loan was in its final stages.</w:t>
-      </w:r>
-    </w:p>
-    <w:p>
-      <w:pPr>
-        <w:pStyle w:val="FirstParagraph"/>
+        <w:pStyle w:val="BodyText"/>
+      </w:pPr>
+      <w:r>
+        <w:t xml:space="preserve">(b) the reasons for each delay and the pre-conditions to approval, including the effect of the breakdown in relations between Niger and the United States on the loan; and</w:t>
+      </w:r>
+    </w:p>
+    <w:p>
+      <w:pPr>
+        <w:pStyle w:val="BodyText"/>
+      </w:pPr>
+      <w:r>
+        <w:t xml:space="preserve">(c) the timing of the DFC's pause, which GLO later admitted began before the 2024 U.S. presidential election, while GLO was reporting that the loan was in its final stages.</w:t>
+      </w:r>
+    </w:p>
+    <w:p>
+      <w:pPr>
+        <w:pStyle w:val="BodyText"/>
       </w:pPr>
       <w:r>
         <w:t xml:space="preserve">The specific misrepresentations that are relevant to the proposed legal proceeding are when GLO negligently reported that:</w:t>
@@ -353,13 +344,10 @@
     </w:p>
     <w:p>
       <w:pPr>
-        <w:numPr>
-          <w:ilvl w:val="0"/>
-          <w:numId w:val="1002"/>
-        </w:numPr>
-      </w:pPr>
-      <w:r>
-        <w:t xml:space="preserve">the DFC's credit committee approval would happen during January 2024,</w:t>
+        <w:pStyle w:val="BodyText"/>
+      </w:pPr>
+      <w:r>
+        <w:t xml:space="preserve">(a) the DFC's credit committee approval would happen during January 2024,</w:t>
       </w:r>
       <w:r>
         <w:rPr>
@@ -436,13 +424,10 @@
     </w:p>
     <w:p>
       <w:pPr>
-        <w:numPr>
-          <w:ilvl w:val="0"/>
-          <w:numId w:val="1002"/>
-        </w:numPr>
-      </w:pPr>
-      <w:r>
-        <w:t xml:space="preserve">the DFC board's final approval would happen during March 2024,</w:t>
+        <w:pStyle w:val="BodyText"/>
+      </w:pPr>
+      <w:r>
+        <w:t xml:space="preserve">(b) the DFC board's final approval would happen during March 2024,</w:t>
       </w:r>
       <w:r>
         <w:rPr>
@@ -549,7 +534,7 @@
     </w:p>
     <w:p>
       <w:pPr>
-        <w:pStyle w:val="FirstParagraph"/>
+        <w:pStyle w:val="BodyText"/>
       </w:pPr>
       <w:r>
         <w:t xml:space="preserve">Conducting the deep-dive due diligence exercise independent of GLO's disclosures, and primarily at the DFC's own published board records, my conclusion is that the Dasa loan did not come before the DFC board at any board meeting or notational vote in 2024 (March 6, June 5, September 5 and December 4, 2024, and the notational votes through October 28, 2024), and that the DFC's credit committee did not review the loan until about December 2025.</w:t>
@@ -677,13 +662,10 @@
     </w:p>
     <w:p>
       <w:pPr>
-        <w:numPr>
-          <w:ilvl w:val="0"/>
-          <w:numId w:val="1003"/>
-        </w:numPr>
-      </w:pPr>
-      <w:r>
-        <w:t xml:space="preserve">"With the re-engagement of the development banks, the schedule for project financing is targeted for credit committee approval in January followed by final approval in March 2024.";</w:t>
+        <w:pStyle w:val="BodyText"/>
+      </w:pPr>
+      <w:r>
+        <w:t xml:space="preserve">(a) "With the re-engagement of the development banks, the schedule for project financing is targeted for credit committee approval in January followed by final approval in March 2024.";</w:t>
       </w:r>
       <w:r>
         <w:rPr>
@@ -694,13 +676,10 @@
     </w:p>
     <w:p>
       <w:pPr>
-        <w:numPr>
-          <w:ilvl w:val="0"/>
-          <w:numId w:val="1003"/>
-        </w:numPr>
-      </w:pPr>
-      <w:r>
-        <w:t xml:space="preserve">"The Company is well advanced in negotiating a term sheet and expects this to be concluded shortly.";</w:t>
+        <w:pStyle w:val="BodyText"/>
+      </w:pPr>
+      <w:r>
+        <w:t xml:space="preserve">(b) "The Company is well advanced in negotiating a term sheet and expects this to be concluded shortly.";</w:t>
       </w:r>
       <w:r>
         <w:rPr>
@@ -717,13 +696,10 @@
     </w:p>
     <w:p>
       <w:pPr>
-        <w:numPr>
-          <w:ilvl w:val="0"/>
-          <w:numId w:val="1003"/>
-        </w:numPr>
-      </w:pPr>
-      <w:r>
-        <w:t xml:space="preserve">"In view of the uncertainties about the timing of completion of a project financing, the Company has commenced a process to review alternative funding options." [No reference to what the uncertainties were].</w:t>
+        <w:pStyle w:val="BodyText"/>
+      </w:pPr>
+      <w:r>
+        <w:t xml:space="preserve">(c) "In view of the uncertainties about the timing of completion of a project financing, the Company has commenced a process to review alternative funding options." [No reference to what the uncertainties were].</w:t>
       </w:r>
       <w:r>
         <w:rPr>
@@ -734,7 +710,7 @@
     </w:p>
     <w:p>
       <w:pPr>
-        <w:pStyle w:val="FirstParagraph"/>
+        <w:pStyle w:val="BodyText"/>
       </w:pPr>
       <w:r>
         <w:t xml:space="preserve">On December 19, 2023, $2.80 to $2.58 (down 7.9%), GLO announced a C$15 million strategic investment by Regent Mercantile and Stephen Dattels, and Roman stated that the investment "coincides with better visibility on timelines associated with democratic elections and the restoration of supply lines".</w:t>
@@ -822,13 +798,10 @@
     </w:p>
     <w:p>
       <w:pPr>
-        <w:numPr>
-          <w:ilvl w:val="0"/>
-          <w:numId w:val="1004"/>
-        </w:numPr>
-      </w:pPr>
-      <w:r>
-        <w:t xml:space="preserve">on Niger's termination of military cooperation: "Global Atomic understands the two countries are in discussions to reach a mutually acceptable resolution." [No reference to the effect on the DFC loan];</w:t>
+        <w:pStyle w:val="BodyText"/>
+      </w:pPr>
+      <w:r>
+        <w:t xml:space="preserve">(a) on Niger's termination of military cooperation: "Global Atomic understands the two countries are in discussions to reach a mutually acceptable resolution." [No reference to the effect on the DFC loan];</w:t>
       </w:r>
       <w:r>
         <w:rPr>
@@ -845,13 +818,10 @@
     </w:p>
     <w:p>
       <w:pPr>
-        <w:numPr>
-          <w:ilvl w:val="0"/>
-          <w:numId w:val="1004"/>
-        </w:numPr>
-      </w:pPr>
-      <w:r>
-        <w:t xml:space="preserve">in the risk section, the same April and June 2024 dates, "but there is no certainty that the Project Financing will be completed on the terms or in the amounts anticipated by the Company or at all."</w:t>
+        <w:pStyle w:val="BodyText"/>
+      </w:pPr>
+      <w:r>
+        <w:t xml:space="preserve">(b) in the risk section, the same April and June 2024 dates, "but there is no certainty that the Project Financing will be completed on the terms or in the amounts anticipated by the Company or at all."</w:t>
       </w:r>
       <w:r>
         <w:rPr>
@@ -862,7 +832,7 @@
     </w:p>
     <w:p>
       <w:pPr>
-        <w:pStyle w:val="FirstParagraph"/>
+        <w:pStyle w:val="BodyText"/>
       </w:pPr>
       <w:r>
         <w:t xml:space="preserve">On May 13, 2024, $2.20 to $2.10 on the next session (down 4.5%), GLO published its Q1 2024 results and Roman stated: "The banking syndicate has informed us that they anticipate credit committee and final Board approval this quarter."</w:t>
@@ -1312,29 +1282,23 @@
     </w:p>
     <w:p>
       <w:pPr>
-        <w:numPr>
-          <w:ilvl w:val="0"/>
-          <w:numId w:val="1005"/>
-        </w:numPr>
-      </w:pPr>
-      <w:r>
-        <w:t xml:space="preserve">that the DFC had not scheduled, and did not hold, the credit committee and board approvals on the dates GLO reported, and why; and</w:t>
-      </w:r>
-    </w:p>
-    <w:p>
-      <w:pPr>
-        <w:numPr>
-          <w:ilvl w:val="0"/>
-          <w:numId w:val="1005"/>
-        </w:numPr>
-      </w:pPr>
-      <w:r>
-        <w:t xml:space="preserve">that the DFC's questions and pause concerned matters, including the relationship between Niger and the United States, that GLO described as answered and as in their final stages?</w:t>
-      </w:r>
-    </w:p>
-    <w:p>
-      <w:pPr>
-        <w:pStyle w:val="FirstParagraph"/>
+        <w:pStyle w:val="BodyText"/>
+      </w:pPr>
+      <w:r>
+        <w:t xml:space="preserve">(a) that the DFC had not scheduled, and did not hold, the credit committee and board approvals on the dates GLO reported, and why; and</w:t>
+      </w:r>
+    </w:p>
+    <w:p>
+      <w:pPr>
+        <w:pStyle w:val="BodyText"/>
+      </w:pPr>
+      <w:r>
+        <w:t xml:space="preserve">(b) that the DFC's questions and pause concerned matters, including the relationship between Niger and the United States, that GLO described as answered and as in their final stages?</w:t>
+      </w:r>
+    </w:p>
+    <w:p>
+      <w:pPr>
+        <w:pStyle w:val="BodyText"/>
       </w:pPr>
       <w:r>
         <w:t xml:space="preserve">The affirmative defences will be that each date was attributed to the bank and carried cautionary language, that the July 16, 2024 postponement was disclosed promptly, that the coup designation and the U.S. withdrawal were Acts of State known to the market, that the 2024 election and the change of administration were new events, and that the DFC did approve the loan in September 2026.</w:t>
@@ -1404,29 +1368,23 @@
     </w:p>
     <w:p>
       <w:pPr>
-        <w:numPr>
-          <w:ilvl w:val="0"/>
-          <w:numId w:val="1006"/>
-        </w:numPr>
-      </w:pPr>
-      <w:r>
-        <w:t xml:space="preserve">The Impugned Offerings for the primary market causes of action occurred on October 16, 2024 (the October 2024 Offering, with Red Cloud as underwriter).</w:t>
-      </w:r>
-    </w:p>
-    <w:p>
-      <w:pPr>
-        <w:numPr>
-          <w:ilvl w:val="0"/>
-          <w:numId w:val="1006"/>
-        </w:numPr>
-      </w:pPr>
-      <w:r>
-        <w:t xml:space="preserve">The Class Period for the secondary market causes of action would be November 10, 2023 through January 23, 2025.</w:t>
-      </w:r>
-    </w:p>
-    <w:p>
-      <w:pPr>
-        <w:pStyle w:val="FirstParagraph"/>
+        <w:pStyle w:val="BodyText"/>
+      </w:pPr>
+      <w:r>
+        <w:t xml:space="preserve">(a) The Impugned Offerings for the primary market causes of action occurred on October 16, 2024 (the October 2024 Offering, with Red Cloud as underwriter).</w:t>
+      </w:r>
+    </w:p>
+    <w:p>
+      <w:pPr>
+        <w:pStyle w:val="BodyText"/>
+      </w:pPr>
+      <w:r>
+        <w:t xml:space="preserve">(b) The Class Period for the secondary market causes of action would be November 10, 2023 through January 23, 2025.</w:t>
+      </w:r>
+    </w:p>
+    <w:p>
+      <w:pPr>
+        <w:pStyle w:val="BodyText"/>
       </w:pPr>
       <w:r>
         <w:rPr>
@@ -1446,57 +1404,42 @@
     </w:p>
     <w:p>
       <w:pPr>
-        <w:numPr>
-          <w:ilvl w:val="0"/>
-          <w:numId w:val="1007"/>
-        </w:numPr>
-      </w:pPr>
-      <w:r>
-        <w:t xml:space="preserve">Common law. The common law misrepresentation cause of action for negligent misrepresentation are:</w:t>
-      </w:r>
-    </w:p>
-    <w:p>
-      <w:pPr>
-        <w:numPr>
-          <w:ilvl w:val="0"/>
-          <w:numId w:val="1007"/>
-        </w:numPr>
-      </w:pPr>
-      <w:r>
-        <w:t xml:space="preserve">Duty of care based on a special relationship between the plaintiff and the defendant;</w:t>
-      </w:r>
-    </w:p>
-    <w:p>
-      <w:pPr>
-        <w:numPr>
-          <w:ilvl w:val="0"/>
-          <w:numId w:val="1008"/>
-        </w:numPr>
-      </w:pPr>
-      <w:r>
-        <w:t xml:space="preserve">An untrue, inaccurate, or misleading representation;</w:t>
-      </w:r>
-    </w:p>
-    <w:p>
-      <w:pPr>
-        <w:numPr>
-          <w:ilvl w:val="0"/>
-          <w:numId w:val="1008"/>
-        </w:numPr>
-      </w:pPr>
-      <w:r>
-        <w:t xml:space="preserve">The defendant making the representation negligently;</w:t>
-      </w:r>
-    </w:p>
-    <w:p>
-      <w:pPr>
-        <w:numPr>
-          <w:ilvl w:val="0"/>
-          <w:numId w:val="1008"/>
-        </w:numPr>
-      </w:pPr>
-      <w:r>
-        <w:t xml:space="preserve">The plaintiff having reasonably relied on the misrepresentation;</w:t>
+        <w:pStyle w:val="BodyText"/>
+      </w:pPr>
+      <w:r>
+        <w:t xml:space="preserve">(a) Common law. The common law misrepresentation cause of action for negligent misrepresentation are:</w:t>
+      </w:r>
+    </w:p>
+    <w:p>
+      <w:pPr>
+        <w:pStyle w:val="BodyText"/>
+      </w:pPr>
+      <w:r>
+        <w:t xml:space="preserve">(i) Duty of care based on a special relationship between the plaintiff and the defendant;</w:t>
+      </w:r>
+    </w:p>
+    <w:p>
+      <w:pPr>
+        <w:pStyle w:val="BodyText"/>
+      </w:pPr>
+      <w:r>
+        <w:t xml:space="preserve">(ii) An untrue, inaccurate, or misleading representation;</w:t>
+      </w:r>
+    </w:p>
+    <w:p>
+      <w:pPr>
+        <w:pStyle w:val="BodyText"/>
+      </w:pPr>
+      <w:r>
+        <w:t xml:space="preserve">(iii) The defendant making the representation negligently;</w:t>
+      </w:r>
+    </w:p>
+    <w:p>
+      <w:pPr>
+        <w:pStyle w:val="BodyText"/>
+      </w:pPr>
+      <w:r>
+        <w:t xml:space="preserve">(iv) The plaintiff having reasonably relied on the misrepresentation;</w:t>
       </w:r>
       <w:r>
         <w:rPr>
@@ -1513,73 +1456,55 @@
     </w:p>
     <w:p>
       <w:pPr>
-        <w:numPr>
-          <w:ilvl w:val="0"/>
-          <w:numId w:val="1008"/>
-        </w:numPr>
-      </w:pPr>
-      <w:r>
-        <w:t xml:space="preserve">The plaintiff suffered damages as a consequence of relying on the misrepresentation.</w:t>
-      </w:r>
-    </w:p>
-    <w:p>
-      <w:pPr>
-        <w:numPr>
-          <w:ilvl w:val="0"/>
-          <w:numId w:val="1009"/>
-        </w:numPr>
-      </w:pPr>
-      <w:r>
-        <w:t xml:space="preserve">Securities Act, Part XXIII, s. 130 primary market; and</w:t>
-      </w:r>
-    </w:p>
-    <w:p>
-      <w:pPr>
-        <w:numPr>
-          <w:ilvl w:val="0"/>
-          <w:numId w:val="1009"/>
-        </w:numPr>
-      </w:pPr>
-      <w:r>
-        <w:t xml:space="preserve">Securities Act, Part XXIII.1, s. 138.3 secondary market, if leave is granted, the constituent elements of the statutory cause of action are:</w:t>
-      </w:r>
-    </w:p>
-    <w:p>
-      <w:pPr>
-        <w:numPr>
-          <w:ilvl w:val="0"/>
-          <w:numId w:val="1009"/>
-        </w:numPr>
-      </w:pPr>
-      <w:r>
-        <w:t xml:space="preserve">the making of a misrepresentation or the failure to disclose a material fact;</w:t>
-      </w:r>
-    </w:p>
-    <w:p>
-      <w:pPr>
-        <w:numPr>
-          <w:ilvl w:val="0"/>
-          <w:numId w:val="1010"/>
-        </w:numPr>
-      </w:pPr>
-      <w:r>
-        <w:t xml:space="preserve">a public correction of the false information; and</w:t>
-      </w:r>
-    </w:p>
-    <w:p>
-      <w:pPr>
-        <w:numPr>
-          <w:ilvl w:val="0"/>
-          <w:numId w:val="1010"/>
-        </w:numPr>
-      </w:pPr>
-      <w:r>
-        <w:t xml:space="preserve">the trading of a security between the time of the misrepresentation or the failure to disclose a material fact.</w:t>
-      </w:r>
-    </w:p>
-    <w:p>
-      <w:pPr>
-        <w:pStyle w:val="FirstParagraph"/>
+        <w:pStyle w:val="BodyText"/>
+      </w:pPr>
+      <w:r>
+        <w:t xml:space="preserve">(v) The plaintiff suffered damages as a consequence of relying on the misrepresentation.</w:t>
+      </w:r>
+    </w:p>
+    <w:p>
+      <w:pPr>
+        <w:pStyle w:val="BodyText"/>
+      </w:pPr>
+      <w:r>
+        <w:t xml:space="preserve">(b) Securities Act, Part XXIII, s. 130 primary market; and</w:t>
+      </w:r>
+    </w:p>
+    <w:p>
+      <w:pPr>
+        <w:pStyle w:val="BodyText"/>
+      </w:pPr>
+      <w:r>
+        <w:t xml:space="preserve">(c) Securities Act, Part XXIII.1, s. 138.3 secondary market, if leave is granted, the constituent elements of the statutory cause of action are:</w:t>
+      </w:r>
+    </w:p>
+    <w:p>
+      <w:pPr>
+        <w:pStyle w:val="BodyText"/>
+      </w:pPr>
+      <w:r>
+        <w:t xml:space="preserve">(i) the making of a misrepresentation or the failure to disclose a material fact;</w:t>
+      </w:r>
+    </w:p>
+    <w:p>
+      <w:pPr>
+        <w:pStyle w:val="BodyText"/>
+      </w:pPr>
+      <w:r>
+        <w:t xml:space="preserve">(ii) a public correction of the false information; and</w:t>
+      </w:r>
+    </w:p>
+    <w:p>
+      <w:pPr>
+        <w:pStyle w:val="BodyText"/>
+      </w:pPr>
+      <w:r>
+        <w:t xml:space="preserve">(iii) the trading of a security between the time of the misrepresentation or the failure to disclose a material fact.</w:t>
+      </w:r>
+    </w:p>
+    <w:p>
+      <w:pPr>
+        <w:pStyle w:val="BodyText"/>
       </w:pPr>
       <w:r>
         <w:t xml:space="preserve">To plead the statutory causes of action, the plaintiff should: (1) identify the inculpatory statement or omission and when it was made or ought to have been made; (2) specify the falseness of the inculpatory statement; and (3) identify the public correction and when it was made.</w:t>
@@ -1621,13 +1546,10 @@
     </w:p>
     <w:p>
       <w:pPr>
-        <w:numPr>
-          <w:ilvl w:val="0"/>
-          <w:numId w:val="1011"/>
-        </w:numPr>
-      </w:pPr>
-      <w:r>
-        <w:t xml:space="preserve">First, from November 10, 2023 to November 12, 2024, GLO gave the market a credit committee date or a board date in every quarter, and moved it every quarter: January and March 2024, then April and June 2024, then Q2 2024, then mid-July and September 2024, then October 2024, then Q3 and Q4 2024 in two documents released the same day, then early Q1 2025.</w:t>
+        <w:pStyle w:val="BodyText"/>
+      </w:pPr>
+      <w:r>
+        <w:t xml:space="preserve">(a) First, from November 10, 2023 to November 12, 2024, GLO gave the market a credit committee date or a board date in every quarter, and moved it every quarter: January and March 2024, then April and June 2024, then Q2 2024, then mid-July and September 2024, then October 2024, then Q3 and Q4 2024 in two documents released the same day, then early Q1 2025.</w:t>
       </w:r>
       <w:r>
         <w:rPr>
@@ -1656,13 +1578,10 @@
     </w:p>
     <w:p>
       <w:pPr>
-        <w:numPr>
-          <w:ilvl w:val="0"/>
-          <w:numId w:val="1011"/>
-        </w:numPr>
-      </w:pPr>
-      <w:r>
-        <w:t xml:space="preserve">Second, after the July 2024 postponement GLO did not retreat to forecasts; it escalated to statements of present fact. On October 29, 2024 the bank had "confirmed" its intention to approve; on November 12, 2024 Dasa was "in the final stages of obtaining approval" and GLO had "answered all geo-political concerns raised by the bank".</w:t>
+        <w:pStyle w:val="BodyText"/>
+      </w:pPr>
+      <w:r>
+        <w:t xml:space="preserve">(b) Second, after the July 2024 postponement GLO did not retreat to forecasts; it escalated to statements of present fact. On October 29, 2024 the bank had "confirmed" its intention to approve; on November 12, 2024 Dasa was "in the final stages of obtaining approval" and GLO had "answered all geo-political concerns raised by the bank".</w:t>
       </w:r>
       <w:r>
         <w:rPr>
@@ -1691,13 +1610,10 @@
     </w:p>
     <w:p>
       <w:pPr>
-        <w:numPr>
-          <w:ilvl w:val="0"/>
-          <w:numId w:val="1011"/>
-        </w:numPr>
-      </w:pPr>
-      <w:r>
-        <w:t xml:space="preserve">Third, GLO continued to report U.S. Government support while the relationship between Niger and the United States broke down: the coup designation of October 2023, the termination of military cooperation in March 2024 after U.S. officials raised concerns about uranium, and the agreed withdrawal of U.S. forces by September 15, 2024.</w:t>
+        <w:pStyle w:val="BodyText"/>
+      </w:pPr>
+      <w:r>
+        <w:t xml:space="preserve">(c) Third, GLO continued to report U.S. Government support while the relationship between Niger and the United States broke down: the coup designation of October 2023, the termination of military cooperation in March 2024 after U.S. officials raised concerns about uranium, and the agreed withdrawal of U.S. forces by September 15, 2024.</w:t>
       </w:r>
       <w:r>
         <w:rPr>
@@ -1726,7 +1642,7 @@
     </w:p>
     <w:p>
       <w:pPr>
-        <w:pStyle w:val="FirstParagraph"/>
+        <w:pStyle w:val="BodyText"/>
       </w:pPr>
       <w:r>
         <w:t xml:space="preserve">The Class Period starts on November 10, 2023, the first document reporting that the banks were authorized to "finalize funding arrangements" and the first dated schedule; an alternative start is March 27, 2024, the 2023 MD&amp;A, the first core document with dated credit committee and board months.</w:t>
@@ -1762,40 +1678,31 @@
     </w:p>
     <w:p>
       <w:pPr>
-        <w:numPr>
-          <w:ilvl w:val="0"/>
-          <w:numId w:val="1012"/>
-        </w:numPr>
-      </w:pPr>
-      <w:r>
-        <w:t xml:space="preserve">the status of GLO's application before the DFC, including that no credit committee or board date had been fixed by the DFC on the dates reported;</w:t>
-      </w:r>
-    </w:p>
-    <w:p>
-      <w:pPr>
-        <w:numPr>
-          <w:ilvl w:val="0"/>
-          <w:numId w:val="1012"/>
-        </w:numPr>
-      </w:pPr>
-      <w:r>
-        <w:t xml:space="preserve">the reasons each reported date was missed, including the questions the DFC required GLO to answer and the pause in the DFC's process before and after the 2024 U.S. presidential election; and</w:t>
-      </w:r>
-    </w:p>
-    <w:p>
-      <w:pPr>
-        <w:numPr>
-          <w:ilvl w:val="0"/>
-          <w:numId w:val="1012"/>
-        </w:numPr>
-      </w:pPr>
-      <w:r>
-        <w:t xml:space="preserve">the effect of the breakdown in relations between Niger and the United States on the DFC loan, and the pre-conditions of the DFC's approval.</w:t>
-      </w:r>
-    </w:p>
-    <w:p>
-      <w:pPr>
-        <w:pStyle w:val="FirstParagraph"/>
+        <w:pStyle w:val="BodyText"/>
+      </w:pPr>
+      <w:r>
+        <w:t xml:space="preserve">(a) the status of GLO's application before the DFC, including that no credit committee or board date had been fixed by the DFC on the dates reported;</w:t>
+      </w:r>
+    </w:p>
+    <w:p>
+      <w:pPr>
+        <w:pStyle w:val="BodyText"/>
+      </w:pPr>
+      <w:r>
+        <w:t xml:space="preserve">(b) the reasons each reported date was missed, including the questions the DFC required GLO to answer and the pause in the DFC's process before and after the 2024 U.S. presidential election; and</w:t>
+      </w:r>
+    </w:p>
+    <w:p>
+      <w:pPr>
+        <w:pStyle w:val="BodyText"/>
+      </w:pPr>
+      <w:r>
+        <w:t xml:space="preserve">(c) the effect of the breakdown in relations between Niger and the United States on the DFC loan, and the pre-conditions of the DFC's approval.</w:t>
+      </w:r>
+    </w:p>
+    <w:p>
+      <w:pPr>
+        <w:pStyle w:val="BodyText"/>
       </w:pPr>
       <w:r>
         <w:t xml:space="preserve">For each of the Public Corrective Statements, the allegation to link the statements to the Impugned Documents would be:</w:t>
@@ -1803,13 +1710,10 @@
     </w:p>
     <w:p>
       <w:pPr>
-        <w:numPr>
-          <w:ilvl w:val="0"/>
-          <w:numId w:val="1013"/>
-        </w:numPr>
-      </w:pPr>
-      <w:r>
-        <w:t xml:space="preserve">On July 16, 2024, $2.02 down to $1.67 (down 17.3%) on the next session, GLO reported that the bank decided not to bring Dasa to its July credit committee, citing a need to answer and confirm additional questions.</w:t>
+        <w:pStyle w:val="BodyText"/>
+      </w:pPr>
+      <w:r>
+        <w:t xml:space="preserve">(a) On July 16, 2024, $2.02 down to $1.67 (down 17.3%) on the next session, GLO reported that the bank decided not to bring Dasa to its July credit committee, citing a need to answer and confirm additional questions.</w:t>
       </w:r>
       <w:r>
         <w:rPr>
@@ -1820,24 +1724,18 @@
     </w:p>
     <w:p>
       <w:pPr>
-        <w:numPr>
-          <w:ilvl w:val="0"/>
-          <w:numId w:val="1013"/>
-        </w:numPr>
-      </w:pPr>
-      <w:r>
-        <w:t xml:space="preserve">The importance of the July 16, 2024 disclosure is that it was the first time GLO told the market that a reported date was missed because of the bank's unanswered questions, against the June 17, 2024 report that final documentation was being completed for a scheduled credit committee.</w:t>
-      </w:r>
-    </w:p>
-    <w:p>
-      <w:pPr>
-        <w:numPr>
-          <w:ilvl w:val="0"/>
-          <w:numId w:val="1013"/>
-        </w:numPr>
-      </w:pPr>
-      <w:r>
-        <w:t xml:space="preserve">On January 23, 2025, $0.94 down to $0.64 (down 31.9%) on the next session, GLO reported that the major component of Dasa's funding would come as "either a bank financing or a joint venture agreement", together with a discounted, fully warranted placement.</w:t>
+        <w:pStyle w:val="BodyText"/>
+      </w:pPr>
+      <w:r>
+        <w:t xml:space="preserve">(b) The importance of the July 16, 2024 disclosure is that it was the first time GLO told the market that a reported date was missed because of the bank's unanswered questions, against the June 17, 2024 report that final documentation was being completed for a scheduled credit committee.</w:t>
+      </w:r>
+    </w:p>
+    <w:p>
+      <w:pPr>
+        <w:pStyle w:val="BodyText"/>
+      </w:pPr>
+      <w:r>
+        <w:t xml:space="preserve">(c) On January 23, 2025, $0.94 down to $0.64 (down 31.9%) on the next session, GLO reported that the major component of Dasa's funding would come as "either a bank financing or a joint venture agreement", together with a discounted, fully warranted placement.</w:t>
       </w:r>
       <w:r>
         <w:rPr>
@@ -1848,13 +1746,10 @@
     </w:p>
     <w:p>
       <w:pPr>
-        <w:numPr>
-          <w:ilvl w:val="0"/>
-          <w:numId w:val="1013"/>
-        </w:numPr>
-      </w:pPr>
-      <w:r>
-        <w:t xml:space="preserve">The importance of the January 23, 2025 disclosure is that the DFC loan, which GLO had reported as confirmed and in its final stages with approval by early Q1 2025, was now one of two alternatives three weeks into that quarter. The market's reaction was harsh and immediate: the abnormal return was −31.3% with no recovery over the ten-day look-back.</w:t>
+        <w:pStyle w:val="BodyText"/>
+      </w:pPr>
+      <w:r>
+        <w:t xml:space="preserve">(d) The importance of the January 23, 2025 disclosure is that the DFC loan, which GLO had reported as confirmed and in its final stages with approval by early Q1 2025, was now one of two alternatives three weeks into that quarter. The market's reaction was harsh and immediate: the abnormal return was −31.3% with no recovery over the ten-day look-back.</w:t>
       </w:r>
       <w:r>
         <w:rPr>
@@ -1865,7 +1760,7 @@
     </w:p>
     <w:p>
       <w:pPr>
-        <w:pStyle w:val="FirstParagraph"/>
+        <w:pStyle w:val="BodyText"/>
       </w:pPr>
       <w:r>
         <w:rPr>
@@ -4421,653 +4316,8 @@
       </w:pPr>
     </w:lvl>
   </w:abstractNum>
-  <w:abstractNum w:abstractNumId="99731">
-    <w:nsid w:val="A99731"/>
-    <w:multiLevelType w:val="multilevel"/>
-    <w:lvl w:ilvl="0">
-      <w:start w:val="1"/>
-      <w:numFmt w:val="lowerLetter"/>
-      <w:lvlText w:val="(%1)"/>
-      <w:lvlJc w:val="left"/>
-      <w:pPr>
-        <w:ind w:left="720" w:hanging="480"/>
-      </w:pPr>
-    </w:lvl>
-    <w:lvl w:ilvl="1">
-      <w:start w:val="1"/>
-      <w:numFmt w:val="lowerLetter"/>
-      <w:lvlText w:val="(%2)"/>
-      <w:lvlJc w:val="left"/>
-      <w:pPr>
-        <w:ind w:left="1440" w:hanging="480"/>
-      </w:pPr>
-    </w:lvl>
-    <w:lvl w:ilvl="2">
-      <w:start w:val="1"/>
-      <w:numFmt w:val="lowerLetter"/>
-      <w:lvlText w:val="(%3)"/>
-      <w:lvlJc w:val="left"/>
-      <w:pPr>
-        <w:ind w:left="2160" w:hanging="480"/>
-      </w:pPr>
-    </w:lvl>
-    <w:lvl w:ilvl="3">
-      <w:start w:val="1"/>
-      <w:numFmt w:val="lowerLetter"/>
-      <w:lvlText w:val="(%4)"/>
-      <w:lvlJc w:val="left"/>
-      <w:pPr>
-        <w:ind w:left="2880" w:hanging="480"/>
-      </w:pPr>
-    </w:lvl>
-    <w:lvl w:ilvl="4">
-      <w:start w:val="1"/>
-      <w:numFmt w:val="lowerLetter"/>
-      <w:lvlText w:val="(%5)"/>
-      <w:lvlJc w:val="left"/>
-      <w:pPr>
-        <w:ind w:left="3600" w:hanging="480"/>
-      </w:pPr>
-    </w:lvl>
-    <w:lvl w:ilvl="5">
-      <w:start w:val="1"/>
-      <w:numFmt w:val="lowerLetter"/>
-      <w:lvlText w:val="(%6)"/>
-      <w:lvlJc w:val="left"/>
-      <w:pPr>
-        <w:ind w:left="4320" w:hanging="480"/>
-      </w:pPr>
-    </w:lvl>
-    <w:lvl w:ilvl="6">
-      <w:start w:val="1"/>
-      <w:numFmt w:val="lowerLetter"/>
-      <w:lvlText w:val="(%7)"/>
-      <w:lvlJc w:val="left"/>
-      <w:pPr>
-        <w:ind w:left="5040" w:hanging="480"/>
-      </w:pPr>
-    </w:lvl>
-    <w:lvl w:ilvl="7">
-      <w:start w:val="1"/>
-      <w:numFmt w:val="lowerLetter"/>
-      <w:lvlText w:val="(%8)"/>
-      <w:lvlJc w:val="left"/>
-      <w:pPr>
-        <w:ind w:left="5760" w:hanging="480"/>
-      </w:pPr>
-    </w:lvl>
-    <w:lvl w:ilvl="8">
-      <w:start w:val="1"/>
-      <w:numFmt w:val="lowerLetter"/>
-      <w:lvlText w:val="(%9)"/>
-      <w:lvlJc w:val="left"/>
-      <w:pPr>
-        <w:ind w:left="6480" w:hanging="480"/>
-      </w:pPr>
-    </w:lvl>
-  </w:abstractNum>
-  <w:abstractNum w:abstractNumId="99532">
-    <w:nsid w:val="A99532"/>
-    <w:multiLevelType w:val="multilevel"/>
-    <w:lvl w:ilvl="0">
-      <w:start w:val="2"/>
-      <w:numFmt w:val="lowerRoman"/>
-      <w:lvlText w:val="(%1)"/>
-      <w:lvlJc w:val="left"/>
-      <w:pPr>
-        <w:ind w:left="720" w:hanging="480"/>
-      </w:pPr>
-    </w:lvl>
-    <w:lvl w:ilvl="1">
-      <w:start w:val="2"/>
-      <w:numFmt w:val="lowerRoman"/>
-      <w:lvlText w:val="(%2)"/>
-      <w:lvlJc w:val="left"/>
-      <w:pPr>
-        <w:ind w:left="1440" w:hanging="480"/>
-      </w:pPr>
-    </w:lvl>
-    <w:lvl w:ilvl="2">
-      <w:start w:val="2"/>
-      <w:numFmt w:val="lowerRoman"/>
-      <w:lvlText w:val="(%3)"/>
-      <w:lvlJc w:val="left"/>
-      <w:pPr>
-        <w:ind w:left="2160" w:hanging="480"/>
-      </w:pPr>
-    </w:lvl>
-    <w:lvl w:ilvl="3">
-      <w:start w:val="2"/>
-      <w:numFmt w:val="lowerRoman"/>
-      <w:lvlText w:val="(%4)"/>
-      <w:lvlJc w:val="left"/>
-      <w:pPr>
-        <w:ind w:left="2880" w:hanging="480"/>
-      </w:pPr>
-    </w:lvl>
-    <w:lvl w:ilvl="4">
-      <w:start w:val="2"/>
-      <w:numFmt w:val="lowerRoman"/>
-      <w:lvlText w:val="(%5)"/>
-      <w:lvlJc w:val="left"/>
-      <w:pPr>
-        <w:ind w:left="3600" w:hanging="480"/>
-      </w:pPr>
-    </w:lvl>
-    <w:lvl w:ilvl="5">
-      <w:start w:val="2"/>
-      <w:numFmt w:val="lowerRoman"/>
-      <w:lvlText w:val="(%6)"/>
-      <w:lvlJc w:val="left"/>
-      <w:pPr>
-        <w:ind w:left="4320" w:hanging="480"/>
-      </w:pPr>
-    </w:lvl>
-    <w:lvl w:ilvl="6">
-      <w:start w:val="2"/>
-      <w:numFmt w:val="lowerRoman"/>
-      <w:lvlText w:val="(%7)"/>
-      <w:lvlJc w:val="left"/>
-      <w:pPr>
-        <w:ind w:left="5040" w:hanging="480"/>
-      </w:pPr>
-    </w:lvl>
-    <w:lvl w:ilvl="7">
-      <w:start w:val="2"/>
-      <w:numFmt w:val="lowerRoman"/>
-      <w:lvlText w:val="(%8)"/>
-      <w:lvlJc w:val="left"/>
-      <w:pPr>
-        <w:ind w:left="5760" w:hanging="480"/>
-      </w:pPr>
-    </w:lvl>
-    <w:lvl w:ilvl="8">
-      <w:start w:val="2"/>
-      <w:numFmt w:val="lowerRoman"/>
-      <w:lvlText w:val="(%9)"/>
-      <w:lvlJc w:val="left"/>
-      <w:pPr>
-        <w:ind w:left="6480" w:hanging="480"/>
-      </w:pPr>
-    </w:lvl>
-  </w:abstractNum>
-  <w:abstractNum w:abstractNumId="99732">
-    <w:nsid w:val="A99732"/>
-    <w:multiLevelType w:val="multilevel"/>
-    <w:lvl w:ilvl="0">
-      <w:start w:val="2"/>
-      <w:numFmt w:val="lowerLetter"/>
-      <w:lvlText w:val="(%1)"/>
-      <w:lvlJc w:val="left"/>
-      <w:pPr>
-        <w:ind w:left="720" w:hanging="480"/>
-      </w:pPr>
-    </w:lvl>
-    <w:lvl w:ilvl="1">
-      <w:start w:val="2"/>
-      <w:numFmt w:val="lowerLetter"/>
-      <w:lvlText w:val="(%2)"/>
-      <w:lvlJc w:val="left"/>
-      <w:pPr>
-        <w:ind w:left="1440" w:hanging="480"/>
-      </w:pPr>
-    </w:lvl>
-    <w:lvl w:ilvl="2">
-      <w:start w:val="2"/>
-      <w:numFmt w:val="lowerLetter"/>
-      <w:lvlText w:val="(%3)"/>
-      <w:lvlJc w:val="left"/>
-      <w:pPr>
-        <w:ind w:left="2160" w:hanging="480"/>
-      </w:pPr>
-    </w:lvl>
-    <w:lvl w:ilvl="3">
-      <w:start w:val="2"/>
-      <w:numFmt w:val="lowerLetter"/>
-      <w:lvlText w:val="(%4)"/>
-      <w:lvlJc w:val="left"/>
-      <w:pPr>
-        <w:ind w:left="2880" w:hanging="480"/>
-      </w:pPr>
-    </w:lvl>
-    <w:lvl w:ilvl="4">
-      <w:start w:val="2"/>
-      <w:numFmt w:val="lowerLetter"/>
-      <w:lvlText w:val="(%5)"/>
-      <w:lvlJc w:val="left"/>
-      <w:pPr>
-        <w:ind w:left="3600" w:hanging="480"/>
-      </w:pPr>
-    </w:lvl>
-    <w:lvl w:ilvl="5">
-      <w:start w:val="2"/>
-      <w:numFmt w:val="lowerLetter"/>
-      <w:lvlText w:val="(%6)"/>
-      <w:lvlJc w:val="left"/>
-      <w:pPr>
-        <w:ind w:left="4320" w:hanging="480"/>
-      </w:pPr>
-    </w:lvl>
-    <w:lvl w:ilvl="6">
-      <w:start w:val="2"/>
-      <w:numFmt w:val="lowerLetter"/>
-      <w:lvlText w:val="(%7)"/>
-      <w:lvlJc w:val="left"/>
-      <w:pPr>
-        <w:ind w:left="5040" w:hanging="480"/>
-      </w:pPr>
-    </w:lvl>
-    <w:lvl w:ilvl="7">
-      <w:start w:val="2"/>
-      <w:numFmt w:val="lowerLetter"/>
-      <w:lvlText w:val="(%8)"/>
-      <w:lvlJc w:val="left"/>
-      <w:pPr>
-        <w:ind w:left="5760" w:hanging="480"/>
-      </w:pPr>
-    </w:lvl>
-    <w:lvl w:ilvl="8">
-      <w:start w:val="2"/>
-      <w:numFmt w:val="lowerLetter"/>
-      <w:lvlText w:val="(%9)"/>
-      <w:lvlJc w:val="left"/>
-      <w:pPr>
-        <w:ind w:left="6480" w:hanging="480"/>
-      </w:pPr>
-    </w:lvl>
-  </w:abstractNum>
   <w:num w:numId="1000">
     <w:abstractNumId w:val="990"/>
-  </w:num>
-  <w:num w:numId="1001">
-    <w:abstractNumId w:val="99731"/>
-    <w:lvlOverride w:ilvl="0">
-      <w:startOverride w:val="1"/>
-    </w:lvlOverride>
-    <w:lvlOverride w:ilvl="1">
-      <w:startOverride w:val="1"/>
-    </w:lvlOverride>
-    <w:lvlOverride w:ilvl="2">
-      <w:startOverride w:val="1"/>
-    </w:lvlOverride>
-    <w:lvlOverride w:ilvl="3">
-      <w:startOverride w:val="1"/>
-    </w:lvlOverride>
-    <w:lvlOverride w:ilvl="4">
-      <w:startOverride w:val="1"/>
-    </w:lvlOverride>
-    <w:lvlOverride w:ilvl="5">
-      <w:startOverride w:val="1"/>
-    </w:lvlOverride>
-    <w:lvlOverride w:ilvl="6">
-      <w:startOverride w:val="1"/>
-    </w:lvlOverride>
-    <w:lvlOverride w:ilvl="7">
-      <w:startOverride w:val="1"/>
-    </w:lvlOverride>
-    <w:lvlOverride w:ilvl="8">
-      <w:startOverride w:val="1"/>
-    </w:lvlOverride>
-  </w:num>
-  <w:num w:numId="1002">
-    <w:abstractNumId w:val="99731"/>
-    <w:lvlOverride w:ilvl="0">
-      <w:startOverride w:val="1"/>
-    </w:lvlOverride>
-    <w:lvlOverride w:ilvl="1">
-      <w:startOverride w:val="1"/>
-    </w:lvlOverride>
-    <w:lvlOverride w:ilvl="2">
-      <w:startOverride w:val="1"/>
-    </w:lvlOverride>
-    <w:lvlOverride w:ilvl="3">
-      <w:startOverride w:val="1"/>
-    </w:lvlOverride>
-    <w:lvlOverride w:ilvl="4">
-      <w:startOverride w:val="1"/>
-    </w:lvlOverride>
-    <w:lvlOverride w:ilvl="5">
-      <w:startOverride w:val="1"/>
-    </w:lvlOverride>
-    <w:lvlOverride w:ilvl="6">
-      <w:startOverride w:val="1"/>
-    </w:lvlOverride>
-    <w:lvlOverride w:ilvl="7">
-      <w:startOverride w:val="1"/>
-    </w:lvlOverride>
-    <w:lvlOverride w:ilvl="8">
-      <w:startOverride w:val="1"/>
-    </w:lvlOverride>
-  </w:num>
-  <w:num w:numId="1003">
-    <w:abstractNumId w:val="99731"/>
-    <w:lvlOverride w:ilvl="0">
-      <w:startOverride w:val="1"/>
-    </w:lvlOverride>
-    <w:lvlOverride w:ilvl="1">
-      <w:startOverride w:val="1"/>
-    </w:lvlOverride>
-    <w:lvlOverride w:ilvl="2">
-      <w:startOverride w:val="1"/>
-    </w:lvlOverride>
-    <w:lvlOverride w:ilvl="3">
-      <w:startOverride w:val="1"/>
-    </w:lvlOverride>
-    <w:lvlOverride w:ilvl="4">
-      <w:startOverride w:val="1"/>
-    </w:lvlOverride>
-    <w:lvlOverride w:ilvl="5">
-      <w:startOverride w:val="1"/>
-    </w:lvlOverride>
-    <w:lvlOverride w:ilvl="6">
-      <w:startOverride w:val="1"/>
-    </w:lvlOverride>
-    <w:lvlOverride w:ilvl="7">
-      <w:startOverride w:val="1"/>
-    </w:lvlOverride>
-    <w:lvlOverride w:ilvl="8">
-      <w:startOverride w:val="1"/>
-    </w:lvlOverride>
-  </w:num>
-  <w:num w:numId="1004">
-    <w:abstractNumId w:val="99731"/>
-    <w:lvlOverride w:ilvl="0">
-      <w:startOverride w:val="1"/>
-    </w:lvlOverride>
-    <w:lvlOverride w:ilvl="1">
-      <w:startOverride w:val="1"/>
-    </w:lvlOverride>
-    <w:lvlOverride w:ilvl="2">
-      <w:startOverride w:val="1"/>
-    </w:lvlOverride>
-    <w:lvlOverride w:ilvl="3">
-      <w:startOverride w:val="1"/>
-    </w:lvlOverride>
-    <w:lvlOverride w:ilvl="4">
-      <w:startOverride w:val="1"/>
-    </w:lvlOverride>
-    <w:lvlOverride w:ilvl="5">
-      <w:startOverride w:val="1"/>
-    </w:lvlOverride>
-    <w:lvlOverride w:ilvl="6">
-      <w:startOverride w:val="1"/>
-    </w:lvlOverride>
-    <w:lvlOverride w:ilvl="7">
-      <w:startOverride w:val="1"/>
-    </w:lvlOverride>
-    <w:lvlOverride w:ilvl="8">
-      <w:startOverride w:val="1"/>
-    </w:lvlOverride>
-  </w:num>
-  <w:num w:numId="1005">
-    <w:abstractNumId w:val="99731"/>
-    <w:lvlOverride w:ilvl="0">
-      <w:startOverride w:val="1"/>
-    </w:lvlOverride>
-    <w:lvlOverride w:ilvl="1">
-      <w:startOverride w:val="1"/>
-    </w:lvlOverride>
-    <w:lvlOverride w:ilvl="2">
-      <w:startOverride w:val="1"/>
-    </w:lvlOverride>
-    <w:lvlOverride w:ilvl="3">
-      <w:startOverride w:val="1"/>
-    </w:lvlOverride>
-    <w:lvlOverride w:ilvl="4">
-      <w:startOverride w:val="1"/>
-    </w:lvlOverride>
-    <w:lvlOverride w:ilvl="5">
-      <w:startOverride w:val="1"/>
-    </w:lvlOverride>
-    <w:lvlOverride w:ilvl="6">
-      <w:startOverride w:val="1"/>
-    </w:lvlOverride>
-    <w:lvlOverride w:ilvl="7">
-      <w:startOverride w:val="1"/>
-    </w:lvlOverride>
-    <w:lvlOverride w:ilvl="8">
-      <w:startOverride w:val="1"/>
-    </w:lvlOverride>
-  </w:num>
-  <w:num w:numId="1006">
-    <w:abstractNumId w:val="99731"/>
-    <w:lvlOverride w:ilvl="0">
-      <w:startOverride w:val="1"/>
-    </w:lvlOverride>
-    <w:lvlOverride w:ilvl="1">
-      <w:startOverride w:val="1"/>
-    </w:lvlOverride>
-    <w:lvlOverride w:ilvl="2">
-      <w:startOverride w:val="1"/>
-    </w:lvlOverride>
-    <w:lvlOverride w:ilvl="3">
-      <w:startOverride w:val="1"/>
-    </w:lvlOverride>
-    <w:lvlOverride w:ilvl="4">
-      <w:startOverride w:val="1"/>
-    </w:lvlOverride>
-    <w:lvlOverride w:ilvl="5">
-      <w:startOverride w:val="1"/>
-    </w:lvlOverride>
-    <w:lvlOverride w:ilvl="6">
-      <w:startOverride w:val="1"/>
-    </w:lvlOverride>
-    <w:lvlOverride w:ilvl="7">
-      <w:startOverride w:val="1"/>
-    </w:lvlOverride>
-    <w:lvlOverride w:ilvl="8">
-      <w:startOverride w:val="1"/>
-    </w:lvlOverride>
-  </w:num>
-  <w:num w:numId="1007">
-    <w:abstractNumId w:val="99731"/>
-    <w:lvlOverride w:ilvl="0">
-      <w:startOverride w:val="1"/>
-    </w:lvlOverride>
-    <w:lvlOverride w:ilvl="1">
-      <w:startOverride w:val="1"/>
-    </w:lvlOverride>
-    <w:lvlOverride w:ilvl="2">
-      <w:startOverride w:val="1"/>
-    </w:lvlOverride>
-    <w:lvlOverride w:ilvl="3">
-      <w:startOverride w:val="1"/>
-    </w:lvlOverride>
-    <w:lvlOverride w:ilvl="4">
-      <w:startOverride w:val="1"/>
-    </w:lvlOverride>
-    <w:lvlOverride w:ilvl="5">
-      <w:startOverride w:val="1"/>
-    </w:lvlOverride>
-    <w:lvlOverride w:ilvl="6">
-      <w:startOverride w:val="1"/>
-    </w:lvlOverride>
-    <w:lvlOverride w:ilvl="7">
-      <w:startOverride w:val="1"/>
-    </w:lvlOverride>
-    <w:lvlOverride w:ilvl="8">
-      <w:startOverride w:val="1"/>
-    </w:lvlOverride>
-  </w:num>
-  <w:num w:numId="1008">
-    <w:abstractNumId w:val="99532"/>
-    <w:lvlOverride w:ilvl="0">
-      <w:startOverride w:val="2"/>
-    </w:lvlOverride>
-    <w:lvlOverride w:ilvl="1">
-      <w:startOverride w:val="2"/>
-    </w:lvlOverride>
-    <w:lvlOverride w:ilvl="2">
-      <w:startOverride w:val="2"/>
-    </w:lvlOverride>
-    <w:lvlOverride w:ilvl="3">
-      <w:startOverride w:val="2"/>
-    </w:lvlOverride>
-    <w:lvlOverride w:ilvl="4">
-      <w:startOverride w:val="2"/>
-    </w:lvlOverride>
-    <w:lvlOverride w:ilvl="5">
-      <w:startOverride w:val="2"/>
-    </w:lvlOverride>
-    <w:lvlOverride w:ilvl="6">
-      <w:startOverride w:val="2"/>
-    </w:lvlOverride>
-    <w:lvlOverride w:ilvl="7">
-      <w:startOverride w:val="2"/>
-    </w:lvlOverride>
-    <w:lvlOverride w:ilvl="8">
-      <w:startOverride w:val="2"/>
-    </w:lvlOverride>
-  </w:num>
-  <w:num w:numId="1009">
-    <w:abstractNumId w:val="99732"/>
-    <w:lvlOverride w:ilvl="0">
-      <w:startOverride w:val="2"/>
-    </w:lvlOverride>
-    <w:lvlOverride w:ilvl="1">
-      <w:startOverride w:val="2"/>
-    </w:lvlOverride>
-    <w:lvlOverride w:ilvl="2">
-      <w:startOverride w:val="2"/>
-    </w:lvlOverride>
-    <w:lvlOverride w:ilvl="3">
-      <w:startOverride w:val="2"/>
-    </w:lvlOverride>
-    <w:lvlOverride w:ilvl="4">
-      <w:startOverride w:val="2"/>
-    </w:lvlOverride>
-    <w:lvlOverride w:ilvl="5">
-      <w:startOverride w:val="2"/>
-    </w:lvlOverride>
-    <w:lvlOverride w:ilvl="6">
-      <w:startOverride w:val="2"/>
-    </w:lvlOverride>
-    <w:lvlOverride w:ilvl="7">
-      <w:startOverride w:val="2"/>
-    </w:lvlOverride>
-    <w:lvlOverride w:ilvl="8">
-      <w:startOverride w:val="2"/>
-    </w:lvlOverride>
-  </w:num>
-  <w:num w:numId="1010">
-    <w:abstractNumId w:val="99532"/>
-    <w:lvlOverride w:ilvl="0">
-      <w:startOverride w:val="2"/>
-    </w:lvlOverride>
-    <w:lvlOverride w:ilvl="1">
-      <w:startOverride w:val="2"/>
-    </w:lvlOverride>
-    <w:lvlOverride w:ilvl="2">
-      <w:startOverride w:val="2"/>
-    </w:lvlOverride>
-    <w:lvlOverride w:ilvl="3">
-      <w:startOverride w:val="2"/>
-    </w:lvlOverride>
-    <w:lvlOverride w:ilvl="4">
-      <w:startOverride w:val="2"/>
-    </w:lvlOverride>
-    <w:lvlOverride w:ilvl="5">
-      <w:startOverride w:val="2"/>
-    </w:lvlOverride>
-    <w:lvlOverride w:ilvl="6">
-      <w:startOverride w:val="2"/>
-    </w:lvlOverride>
-    <w:lvlOverride w:ilvl="7">
-      <w:startOverride w:val="2"/>
-    </w:lvlOverride>
-    <w:lvlOverride w:ilvl="8">
-      <w:startOverride w:val="2"/>
-    </w:lvlOverride>
-  </w:num>
-  <w:num w:numId="1011">
-    <w:abstractNumId w:val="99731"/>
-    <w:lvlOverride w:ilvl="0">
-      <w:startOverride w:val="1"/>
-    </w:lvlOverride>
-    <w:lvlOverride w:ilvl="1">
-      <w:startOverride w:val="1"/>
-    </w:lvlOverride>
-    <w:lvlOverride w:ilvl="2">
-      <w:startOverride w:val="1"/>
-    </w:lvlOverride>
-    <w:lvlOverride w:ilvl="3">
-      <w:startOverride w:val="1"/>
-    </w:lvlOverride>
-    <w:lvlOverride w:ilvl="4">
-      <w:startOverride w:val="1"/>
-    </w:lvlOverride>
-    <w:lvlOverride w:ilvl="5">
-      <w:startOverride w:val="1"/>
-    </w:lvlOverride>
-    <w:lvlOverride w:ilvl="6">
-      <w:startOverride w:val="1"/>
-    </w:lvlOverride>
-    <w:lvlOverride w:ilvl="7">
-      <w:startOverride w:val="1"/>
-    </w:lvlOverride>
-    <w:lvlOverride w:ilvl="8">
-      <w:startOverride w:val="1"/>
-    </w:lvlOverride>
-  </w:num>
-  <w:num w:numId="1012">
-    <w:abstractNumId w:val="99731"/>
-    <w:lvlOverride w:ilvl="0">
-      <w:startOverride w:val="1"/>
-    </w:lvlOverride>
-    <w:lvlOverride w:ilvl="1">
-      <w:startOverride w:val="1"/>
-    </w:lvlOverride>
-    <w:lvlOverride w:ilvl="2">
-      <w:startOverride w:val="1"/>
-    </w:lvlOverride>
-    <w:lvlOverride w:ilvl="3">
-      <w:startOverride w:val="1"/>
-    </w:lvlOverride>
-    <w:lvlOverride w:ilvl="4">
-      <w:startOverride w:val="1"/>
-    </w:lvlOverride>
-    <w:lvlOverride w:ilvl="5">
-      <w:startOverride w:val="1"/>
-    </w:lvlOverride>
-    <w:lvlOverride w:ilvl="6">
-      <w:startOverride w:val="1"/>
-    </w:lvlOverride>
-    <w:lvlOverride w:ilvl="7">
-      <w:startOverride w:val="1"/>
-    </w:lvlOverride>
-    <w:lvlOverride w:ilvl="8">
-      <w:startOverride w:val="1"/>
-    </w:lvlOverride>
-  </w:num>
-  <w:num w:numId="1013">
-    <w:abstractNumId w:val="99731"/>
-    <w:lvlOverride w:ilvl="0">
-      <w:startOverride w:val="1"/>
-    </w:lvlOverride>
-    <w:lvlOverride w:ilvl="1">
-      <w:startOverride w:val="1"/>
-    </w:lvlOverride>
-    <w:lvlOverride w:ilvl="2">
-      <w:startOverride w:val="1"/>
-    </w:lvlOverride>
-    <w:lvlOverride w:ilvl="3">
-      <w:startOverride w:val="1"/>
-    </w:lvlOverride>
-    <w:lvlOverride w:ilvl="4">
-      <w:startOverride w:val="1"/>
-    </w:lvlOverride>
-    <w:lvlOverride w:ilvl="5">
-      <w:startOverride w:val="1"/>
-    </w:lvlOverride>
-    <w:lvlOverride w:ilvl="6">
-      <w:startOverride w:val="1"/>
-    </w:lvlOverride>
-    <w:lvlOverride w:ilvl="7">
-      <w:startOverride w:val="1"/>
-    </w:lvlOverride>
-    <w:lvlOverride w:ilvl="8">
-      <w:startOverride w:val="1"/>
-    </w:lvlOverride>
   </w:num>
 </w:numbering>
 </file>

</xml_diff>